<commit_message>
fix(docs): atualizar CNPJ oficial da Associacao para 32.131.752/0001-88
</commit_message>
<xml_diff>
--- a/PROPOSTA_PATROCINIO_LOVE_COFFEE_2026.docx
+++ b/PROPOSTA_PATROCINIO_LOVE_COFFEE_2026.docx
@@ -39,7 +39,7 @@
           <w:i/>
           <w:iCs/>
         </w:rPr>
-        <w:t xml:space="preserve">CNPJ/MF nº 31.815.736/0001-44</w:t>
+        <w:t xml:space="preserve">CNPJ/MF nº 32.131.752/0001-88</w:t>
       </w:r>
       <w:r>
         <w:br/>
@@ -980,7 +980,7 @@
           <w:b/>
           <w:bCs/>
         </w:rPr>
-        <w:t xml:space="preserve">31.815.736/0001-44</w:t>
+        <w:t xml:space="preserve">32.131.752/0001-88</w:t>
       </w:r>
       <w:r>
         <w:t xml:space="preserve">.</w:t>

</xml_diff>